<commit_message>
Added applictaion.properties in auth service and ran it first time
</commit_message>
<xml_diff>
--- a/backend/NOTEBOOK.docx
+++ b/backend/NOTEBOOK.docx
@@ -465,6 +465,1506 @@
         <w:t xml:space="preserve"> Parent POM ki power.</w:t>
       </w:r>
     </w:p>
+    <w:p>
+      <w:r>
+        <w:br w:type="page"/>
+      </w:r>
+    </w:p>
+    <w:p>
+      <w:pPr>
+        <w:rPr>
+          <w:b/>
+          <w:bCs/>
+        </w:rPr>
+      </w:pPr>
+      <w:r>
+        <w:rPr>
+          <w:rFonts w:ascii="Segoe UI Emoji" w:hAnsi="Segoe UI Emoji" w:cs="Segoe UI Emoji"/>
+          <w:b/>
+          <w:bCs/>
+        </w:rPr>
+        <w:lastRenderedPageBreak/>
+        <w:t>🔥</w:t>
+      </w:r>
+      <w:r>
+        <w:rPr>
+          <w:b/>
+          <w:bCs/>
+        </w:rPr>
+        <w:t xml:space="preserve"> DAY 2 - RIYA BOUTIQUE FASHION</w:t>
+      </w:r>
+    </w:p>
+    <w:p>
+      <w:pPr>
+        <w:rPr>
+          <w:b/>
+          <w:bCs/>
+        </w:rPr>
+      </w:pPr>
+      <w:r>
+        <w:rPr>
+          <w:b/>
+          <w:bCs/>
+        </w:rPr>
+        <w:t>Sprint 1 - First Running Microservice</w:t>
+      </w:r>
+    </w:p>
+    <w:p>
+      <w:proofErr w:type="spellStart"/>
+      <w:r>
+        <w:t>Bhaiiii</w:t>
+      </w:r>
+      <w:proofErr w:type="spellEnd"/>
+      <w:r>
+        <w:t xml:space="preserve">... </w:t>
+      </w:r>
+      <w:r>
+        <w:rPr>
+          <w:rFonts w:ascii="Segoe UI Emoji" w:hAnsi="Segoe UI Emoji" w:cs="Segoe UI Emoji"/>
+        </w:rPr>
+        <w:t>❤️</w:t>
+      </w:r>
+    </w:p>
+    <w:p>
+      <w:proofErr w:type="spellStart"/>
+      <w:r>
+        <w:t>Aaj</w:t>
+      </w:r>
+      <w:proofErr w:type="spellEnd"/>
+      <w:r>
+        <w:t xml:space="preserve"> se </w:t>
+      </w:r>
+      <w:r>
+        <w:rPr>
+          <w:b/>
+          <w:bCs/>
+        </w:rPr>
+        <w:t>actual development</w:t>
+      </w:r>
+      <w:r>
+        <w:t xml:space="preserve"> start.</w:t>
+      </w:r>
+    </w:p>
+    <w:p/>
+    <w:p>
+      <w:pPr>
+        <w:rPr>
+          <w:b/>
+          <w:bCs/>
+        </w:rPr>
+      </w:pPr>
+      <w:r>
+        <w:rPr>
+          <w:rFonts w:ascii="Segoe UI Emoji" w:hAnsi="Segoe UI Emoji" w:cs="Segoe UI Emoji"/>
+          <w:b/>
+          <w:bCs/>
+        </w:rPr>
+        <w:t>🎯</w:t>
+      </w:r>
+      <w:r>
+        <w:rPr>
+          <w:b/>
+          <w:bCs/>
+        </w:rPr>
+        <w:t xml:space="preserve"> Day 2 Goal</w:t>
+      </w:r>
+    </w:p>
+    <w:p>
+      <w:proofErr w:type="spellStart"/>
+      <w:r>
+        <w:t>Aaj</w:t>
+      </w:r>
+      <w:proofErr w:type="spellEnd"/>
+      <w:r>
+        <w:t xml:space="preserve"> </w:t>
+      </w:r>
+      <w:proofErr w:type="spellStart"/>
+      <w:r>
+        <w:t>ke</w:t>
+      </w:r>
+      <w:proofErr w:type="spellEnd"/>
+      <w:r>
+        <w:t xml:space="preserve"> end </w:t>
+      </w:r>
+      <w:proofErr w:type="spellStart"/>
+      <w:r>
+        <w:t>tak</w:t>
+      </w:r>
+      <w:proofErr w:type="spellEnd"/>
+      <w:r>
+        <w:t>:</w:t>
+      </w:r>
+    </w:p>
+    <w:p>
+      <w:r>
+        <w:t>Auth Service</w:t>
+      </w:r>
+    </w:p>
+    <w:p/>
+    <w:p>
+      <w:r>
+        <w:t>↓</w:t>
+      </w:r>
+    </w:p>
+    <w:p/>
+    <w:p>
+      <w:proofErr w:type="spellStart"/>
+      <w:r>
+        <w:t>Application.yml</w:t>
+      </w:r>
+      <w:proofErr w:type="spellEnd"/>
+    </w:p>
+    <w:p/>
+    <w:p>
+      <w:r>
+        <w:t>↓</w:t>
+      </w:r>
+    </w:p>
+    <w:p/>
+    <w:p>
+      <w:r>
+        <w:t>Port Configuration</w:t>
+      </w:r>
+    </w:p>
+    <w:p/>
+    <w:p>
+      <w:r>
+        <w:t>↓</w:t>
+      </w:r>
+    </w:p>
+    <w:p/>
+    <w:p>
+      <w:r>
+        <w:t>Actuator</w:t>
+      </w:r>
+    </w:p>
+    <w:p/>
+    <w:p>
+      <w:r>
+        <w:t>↓</w:t>
+      </w:r>
+    </w:p>
+    <w:p/>
+    <w:p>
+      <w:r>
+        <w:t>Run Successfully</w:t>
+      </w:r>
+    </w:p>
+    <w:p/>
+    <w:p>
+      <w:r>
+        <w:t>↓</w:t>
+      </w:r>
+    </w:p>
+    <w:p/>
+    <w:p>
+      <w:r>
+        <w:t>Health API</w:t>
+      </w:r>
+    </w:p>
+    <w:p/>
+    <w:p>
+      <w:r>
+        <w:t>↓</w:t>
+      </w:r>
+    </w:p>
+    <w:p/>
+    <w:p>
+      <w:r>
+        <w:t>First REST API</w:t>
+      </w:r>
+    </w:p>
+    <w:p/>
+    <w:p>
+      <w:r>
+        <w:t>↓</w:t>
+      </w:r>
+    </w:p>
+    <w:p/>
+    <w:p>
+      <w:r>
+        <w:t>Postman Testing</w:t>
+      </w:r>
+    </w:p>
+    <w:p/>
+    <w:p>
+      <w:r>
+        <w:t xml:space="preserve">Added </w:t>
+      </w:r>
+      <w:proofErr w:type="spellStart"/>
+      <w:proofErr w:type="gramStart"/>
+      <w:r>
+        <w:t>application.properties</w:t>
+      </w:r>
+      <w:proofErr w:type="spellEnd"/>
+      <w:proofErr w:type="gramEnd"/>
+      <w:r>
+        <w:t xml:space="preserve"> in Auth-Service. </w:t>
+      </w:r>
+    </w:p>
+    <w:p>
+      <w:r>
+        <w:t xml:space="preserve">Run the main AuthServiceApplication.java, </w:t>
+      </w:r>
+    </w:p>
+    <w:p>
+      <w:r>
+        <w:t xml:space="preserve">And we should see our service started on the mentioned port in </w:t>
+      </w:r>
+      <w:proofErr w:type="spellStart"/>
+      <w:proofErr w:type="gramStart"/>
+      <w:r>
+        <w:t>application.properties</w:t>
+      </w:r>
+      <w:proofErr w:type="spellEnd"/>
+      <w:proofErr w:type="gramEnd"/>
+      <w:r>
+        <w:t>.</w:t>
+      </w:r>
+    </w:p>
+    <w:p>
+      <w:r>
+        <w:t>Logs:</w:t>
+      </w:r>
+    </w:p>
+    <w:tbl>
+      <w:tblPr>
+        <w:tblStyle w:val="TableGrid"/>
+        <w:tblW w:w="0" w:type="auto"/>
+        <w:tblLook w:val="04A0" w:firstRow="1" w:lastRow="0" w:firstColumn="1" w:lastColumn="0" w:noHBand="0" w:noVBand="1"/>
+      </w:tblPr>
+      <w:tblGrid>
+        <w:gridCol w:w="9350"/>
+      </w:tblGrid>
+      <w:tr>
+        <w:tc>
+          <w:tcPr>
+            <w:tcW w:w="9350" w:type="dxa"/>
+          </w:tcPr>
+          <w:p>
+            <w:r>
+              <w:t>After running the application:</w:t>
+            </w:r>
+            <w:r>
+              <w:br/>
+            </w:r>
+          </w:p>
+          <w:p>
+            <w:r>
+              <w:t xml:space="preserve">  .   ____          _ </w:t>
+            </w:r>
+            <w:proofErr w:type="gramStart"/>
+            <w:r>
+              <w:t xml:space="preserve">           __</w:t>
+            </w:r>
+            <w:proofErr w:type="gramEnd"/>
+            <w:r>
+              <w:t xml:space="preserve"> _ _</w:t>
+            </w:r>
+          </w:p>
+          <w:p>
+            <w:r>
+              <w:t xml:space="preserve"> /\\ / ___</w:t>
+            </w:r>
+            <w:proofErr w:type="gramStart"/>
+            <w:r>
+              <w:t>'_ __ _ _(_)_ __  __ _</w:t>
+            </w:r>
+            <w:proofErr w:type="gramEnd"/>
+            <w:r>
+              <w:t xml:space="preserve"> \ \ \ \</w:t>
+            </w:r>
+          </w:p>
+          <w:p>
+            <w:r>
+              <w:t>( ( )\___ | '_ | '_| | '_ \/ _` | \ \ \ \</w:t>
+            </w:r>
+          </w:p>
+          <w:p>
+            <w:r>
+              <w:t xml:space="preserve"> \\/  ___)| |_)| | | | | || (_| |  ) ) ) )</w:t>
+            </w:r>
+          </w:p>
+          <w:p>
+            <w:r>
+              <w:t xml:space="preserve">  '  |____| .__|_| |_|_| |_\__, | / / / /</w:t>
+            </w:r>
+          </w:p>
+          <w:p>
+            <w:r>
+              <w:t xml:space="preserve"> =========|_|==============|___/=/_/_/_/</w:t>
+            </w:r>
+          </w:p>
+          <w:p/>
+          <w:p>
+            <w:r>
+              <w:t xml:space="preserve"> </w:t>
+            </w:r>
+            <w:proofErr w:type="gramStart"/>
+            <w:r>
+              <w:t>::</w:t>
+            </w:r>
+            <w:proofErr w:type="gramEnd"/>
+            <w:r>
+              <w:t xml:space="preserve"> Spring </w:t>
+            </w:r>
+            <w:proofErr w:type="gramStart"/>
+            <w:r>
+              <w:t>Boot :</w:t>
+            </w:r>
+            <w:proofErr w:type="gramEnd"/>
+            <w:r>
+              <w:t xml:space="preserve">:             </w:t>
+            </w:r>
+            <w:proofErr w:type="gramStart"/>
+            <w:r>
+              <w:t xml:space="preserve">   (</w:t>
+            </w:r>
+            <w:proofErr w:type="gramEnd"/>
+            <w:r>
+              <w:t>v3.5.4)</w:t>
+            </w:r>
+          </w:p>
+          <w:p/>
+          <w:p>
+            <w:r>
+              <w:t>2026-07-17T07:44:44.099+05:</w:t>
+            </w:r>
+            <w:proofErr w:type="gramStart"/>
+            <w:r>
+              <w:t>30  INFO</w:t>
+            </w:r>
+            <w:proofErr w:type="gramEnd"/>
+            <w:r>
+              <w:t xml:space="preserve"> 24296 --- [auth-service] </w:t>
+            </w:r>
+            <w:proofErr w:type="gramStart"/>
+            <w:r>
+              <w:t xml:space="preserve">[  </w:t>
+            </w:r>
+            <w:proofErr w:type="spellStart"/>
+            <w:r>
+              <w:t>restartedMain</w:t>
+            </w:r>
+            <w:proofErr w:type="spellEnd"/>
+            <w:proofErr w:type="gramEnd"/>
+            <w:r>
+              <w:t xml:space="preserve">] </w:t>
+            </w:r>
+            <w:proofErr w:type="spellStart"/>
+            <w:r>
+              <w:t>c.</w:t>
+            </w:r>
+            <w:proofErr w:type="gramStart"/>
+            <w:r>
+              <w:t>r.auth</w:t>
+            </w:r>
+            <w:proofErr w:type="gramEnd"/>
+            <w:r>
+              <w:t>.AuthServiceApplication</w:t>
+            </w:r>
+            <w:proofErr w:type="spellEnd"/>
+            <w:r>
+              <w:t xml:space="preserve">        </w:t>
+            </w:r>
+            <w:proofErr w:type="gramStart"/>
+            <w:r>
+              <w:t xml:space="preserve">  :</w:t>
+            </w:r>
+            <w:proofErr w:type="gramEnd"/>
+            <w:r>
+              <w:t xml:space="preserve"> Starting </w:t>
+            </w:r>
+            <w:proofErr w:type="spellStart"/>
+            <w:r>
+              <w:t>AuthServiceApplication</w:t>
+            </w:r>
+            <w:proofErr w:type="spellEnd"/>
+            <w:r>
+              <w:t xml:space="preserve"> using Java 21.0.11 with PID 24296 (R:\riya-boutique-fashion\backend\riya-boutique-parent\auth-service\target\classes started by </w:t>
+            </w:r>
+            <w:proofErr w:type="spellStart"/>
+            <w:r>
+              <w:t>rahul</w:t>
+            </w:r>
+            <w:proofErr w:type="spellEnd"/>
+            <w:r>
+              <w:t xml:space="preserve"> in R:\riya-boutique-fashion)</w:t>
+            </w:r>
+          </w:p>
+          <w:p>
+            <w:r>
+              <w:t>2026-07-17T07:44:44.105+05:</w:t>
+            </w:r>
+            <w:proofErr w:type="gramStart"/>
+            <w:r>
+              <w:t>30  INFO</w:t>
+            </w:r>
+            <w:proofErr w:type="gramEnd"/>
+            <w:r>
+              <w:t xml:space="preserve"> 24296 --- [auth-service] </w:t>
+            </w:r>
+            <w:proofErr w:type="gramStart"/>
+            <w:r>
+              <w:t xml:space="preserve">[  </w:t>
+            </w:r>
+            <w:proofErr w:type="spellStart"/>
+            <w:r>
+              <w:t>restartedMain</w:t>
+            </w:r>
+            <w:proofErr w:type="spellEnd"/>
+            <w:proofErr w:type="gramEnd"/>
+            <w:r>
+              <w:t xml:space="preserve">] </w:t>
+            </w:r>
+            <w:proofErr w:type="spellStart"/>
+            <w:r>
+              <w:t>c.</w:t>
+            </w:r>
+            <w:proofErr w:type="gramStart"/>
+            <w:r>
+              <w:t>r.auth</w:t>
+            </w:r>
+            <w:proofErr w:type="gramEnd"/>
+            <w:r>
+              <w:t>.AuthServiceApplication</w:t>
+            </w:r>
+            <w:proofErr w:type="spellEnd"/>
+            <w:r>
+              <w:t xml:space="preserve">        </w:t>
+            </w:r>
+            <w:proofErr w:type="gramStart"/>
+            <w:r>
+              <w:t xml:space="preserve">  :</w:t>
+            </w:r>
+            <w:proofErr w:type="gramEnd"/>
+            <w:r>
+              <w:t xml:space="preserve"> No active profile set, falling back to 1 default profile: "default"</w:t>
+            </w:r>
+          </w:p>
+          <w:p>
+            <w:r>
+              <w:lastRenderedPageBreak/>
+              <w:t>2026-07-17T07:44:44.158+05:</w:t>
+            </w:r>
+            <w:proofErr w:type="gramStart"/>
+            <w:r>
+              <w:t>30  INFO</w:t>
+            </w:r>
+            <w:proofErr w:type="gramEnd"/>
+            <w:r>
+              <w:t xml:space="preserve"> 24296 --- [auth-service] </w:t>
+            </w:r>
+            <w:proofErr w:type="gramStart"/>
+            <w:r>
+              <w:t xml:space="preserve">[  </w:t>
+            </w:r>
+            <w:proofErr w:type="spellStart"/>
+            <w:r>
+              <w:t>restartedMain</w:t>
+            </w:r>
+            <w:proofErr w:type="spellEnd"/>
+            <w:r>
+              <w:t>] .</w:t>
+            </w:r>
+            <w:proofErr w:type="spellStart"/>
+            <w:r>
+              <w:t>e</w:t>
+            </w:r>
+            <w:proofErr w:type="gramEnd"/>
+            <w:r>
+              <w:t>.</w:t>
+            </w:r>
+            <w:proofErr w:type="gramStart"/>
+            <w:r>
+              <w:t>DevToolsPropertyDefaultsPostProcessor</w:t>
+            </w:r>
+            <w:proofErr w:type="spellEnd"/>
+            <w:r>
+              <w:t xml:space="preserve"> :</w:t>
+            </w:r>
+            <w:proofErr w:type="gramEnd"/>
+            <w:r>
+              <w:t xml:space="preserve"> </w:t>
+            </w:r>
+            <w:proofErr w:type="spellStart"/>
+            <w:r>
+              <w:t>Devtools</w:t>
+            </w:r>
+            <w:proofErr w:type="spellEnd"/>
+            <w:r>
+              <w:t xml:space="preserve"> property defaults active! Set '</w:t>
+            </w:r>
+            <w:proofErr w:type="spellStart"/>
+            <w:r>
+              <w:t>spring.devtools.add</w:t>
+            </w:r>
+            <w:proofErr w:type="spellEnd"/>
+            <w:r>
+              <w:t>-properties' to 'false' to disable</w:t>
+            </w:r>
+          </w:p>
+          <w:p>
+            <w:r>
+              <w:t>2026-07-17T07:44:44.158+05:</w:t>
+            </w:r>
+            <w:proofErr w:type="gramStart"/>
+            <w:r>
+              <w:t>30  INFO</w:t>
+            </w:r>
+            <w:proofErr w:type="gramEnd"/>
+            <w:r>
+              <w:t xml:space="preserve"> 24296 --- [auth-service] </w:t>
+            </w:r>
+            <w:proofErr w:type="gramStart"/>
+            <w:r>
+              <w:t xml:space="preserve">[  </w:t>
+            </w:r>
+            <w:proofErr w:type="spellStart"/>
+            <w:r>
+              <w:t>restartedMain</w:t>
+            </w:r>
+            <w:proofErr w:type="spellEnd"/>
+            <w:r>
+              <w:t>] .</w:t>
+            </w:r>
+            <w:proofErr w:type="spellStart"/>
+            <w:r>
+              <w:t>e</w:t>
+            </w:r>
+            <w:proofErr w:type="gramEnd"/>
+            <w:r>
+              <w:t>.</w:t>
+            </w:r>
+            <w:proofErr w:type="gramStart"/>
+            <w:r>
+              <w:t>DevToolsPropertyDefaultsPostProcessor</w:t>
+            </w:r>
+            <w:proofErr w:type="spellEnd"/>
+            <w:r>
+              <w:t xml:space="preserve"> :</w:t>
+            </w:r>
+            <w:proofErr w:type="gramEnd"/>
+            <w:r>
+              <w:t xml:space="preserve"> For additional web related logging consider setting the '</w:t>
+            </w:r>
+            <w:proofErr w:type="spellStart"/>
+            <w:r>
+              <w:t>logging.level.web</w:t>
+            </w:r>
+            <w:proofErr w:type="spellEnd"/>
+            <w:r>
+              <w:t>' property to 'DEBUG'</w:t>
+            </w:r>
+          </w:p>
+          <w:p>
+            <w:r>
+              <w:t>2026-07-17T07:44:45.274+05:</w:t>
+            </w:r>
+            <w:proofErr w:type="gramStart"/>
+            <w:r>
+              <w:t>30  INFO</w:t>
+            </w:r>
+            <w:proofErr w:type="gramEnd"/>
+            <w:r>
+              <w:t xml:space="preserve"> 24296 --- [auth-service] </w:t>
+            </w:r>
+            <w:proofErr w:type="gramStart"/>
+            <w:r>
+              <w:t xml:space="preserve">[  </w:t>
+            </w:r>
+            <w:proofErr w:type="spellStart"/>
+            <w:r>
+              <w:t>restartedMain</w:t>
+            </w:r>
+            <w:proofErr w:type="spellEnd"/>
+            <w:proofErr w:type="gramEnd"/>
+            <w:r>
+              <w:t xml:space="preserve">] </w:t>
+            </w:r>
+            <w:proofErr w:type="spellStart"/>
+            <w:r>
+              <w:t>o.s.b.</w:t>
+            </w:r>
+            <w:proofErr w:type="gramStart"/>
+            <w:r>
+              <w:t>w.embedded</w:t>
+            </w:r>
+            <w:proofErr w:type="gramEnd"/>
+            <w:r>
+              <w:t>.</w:t>
+            </w:r>
+            <w:proofErr w:type="gramStart"/>
+            <w:r>
+              <w:t>tomcat.TomcatWebServer</w:t>
+            </w:r>
+            <w:proofErr w:type="spellEnd"/>
+            <w:r>
+              <w:t xml:space="preserve">  :</w:t>
+            </w:r>
+            <w:proofErr w:type="gramEnd"/>
+            <w:r>
+              <w:t xml:space="preserve"> Tomcat initialized with port 8081 (http)</w:t>
+            </w:r>
+          </w:p>
+          <w:p>
+            <w:r>
+              <w:t>2026-07-17T07:44:45.298+05:</w:t>
+            </w:r>
+            <w:proofErr w:type="gramStart"/>
+            <w:r>
+              <w:t>30  INFO</w:t>
+            </w:r>
+            <w:proofErr w:type="gramEnd"/>
+            <w:r>
+              <w:t xml:space="preserve"> 24296 --- [auth-service] </w:t>
+            </w:r>
+            <w:proofErr w:type="gramStart"/>
+            <w:r>
+              <w:t xml:space="preserve">[  </w:t>
+            </w:r>
+            <w:proofErr w:type="spellStart"/>
+            <w:r>
+              <w:t>restartedMain</w:t>
+            </w:r>
+            <w:proofErr w:type="spellEnd"/>
+            <w:proofErr w:type="gramEnd"/>
+            <w:r>
+              <w:t xml:space="preserve">] </w:t>
+            </w:r>
+            <w:proofErr w:type="spellStart"/>
+            <w:proofErr w:type="gramStart"/>
+            <w:r>
+              <w:t>o.apache</w:t>
+            </w:r>
+            <w:proofErr w:type="gramEnd"/>
+            <w:r>
+              <w:t>.</w:t>
+            </w:r>
+            <w:proofErr w:type="gramStart"/>
+            <w:r>
+              <w:t>catalina.core</w:t>
+            </w:r>
+            <w:proofErr w:type="gramEnd"/>
+            <w:r>
+              <w:t>.StandardService</w:t>
+            </w:r>
+            <w:proofErr w:type="spellEnd"/>
+            <w:r>
+              <w:t xml:space="preserve"> </w:t>
+            </w:r>
+            <w:proofErr w:type="gramStart"/>
+            <w:r>
+              <w:t xml:space="preserve">  :</w:t>
+            </w:r>
+            <w:proofErr w:type="gramEnd"/>
+            <w:r>
+              <w:t xml:space="preserve"> Starting service [Tomcat]</w:t>
+            </w:r>
+          </w:p>
+          <w:p>
+            <w:r>
+              <w:t>2026-07-17T07:44:45.298+05:</w:t>
+            </w:r>
+            <w:proofErr w:type="gramStart"/>
+            <w:r>
+              <w:t>30  INFO</w:t>
+            </w:r>
+            <w:proofErr w:type="gramEnd"/>
+            <w:r>
+              <w:t xml:space="preserve"> 24296 --- [auth-service] </w:t>
+            </w:r>
+            <w:proofErr w:type="gramStart"/>
+            <w:r>
+              <w:t xml:space="preserve">[  </w:t>
+            </w:r>
+            <w:proofErr w:type="spellStart"/>
+            <w:r>
+              <w:t>restartedMain</w:t>
+            </w:r>
+            <w:proofErr w:type="spellEnd"/>
+            <w:proofErr w:type="gramEnd"/>
+            <w:r>
+              <w:t xml:space="preserve">] </w:t>
+            </w:r>
+            <w:proofErr w:type="spellStart"/>
+            <w:proofErr w:type="gramStart"/>
+            <w:r>
+              <w:t>o.apache</w:t>
+            </w:r>
+            <w:proofErr w:type="gramEnd"/>
+            <w:r>
+              <w:t>.</w:t>
+            </w:r>
+            <w:proofErr w:type="gramStart"/>
+            <w:r>
+              <w:t>catalina.core</w:t>
+            </w:r>
+            <w:proofErr w:type="gramEnd"/>
+            <w:r>
+              <w:t>.StandardEngine</w:t>
+            </w:r>
+            <w:proofErr w:type="spellEnd"/>
+            <w:r>
+              <w:t xml:space="preserve">  </w:t>
+            </w:r>
+            <w:proofErr w:type="gramStart"/>
+            <w:r>
+              <w:t xml:space="preserve">  :</w:t>
+            </w:r>
+            <w:proofErr w:type="gramEnd"/>
+            <w:r>
+              <w:t xml:space="preserve"> Starting Servlet engine: [Apache Tomcat/10.1.43]</w:t>
+            </w:r>
+          </w:p>
+          <w:p>
+            <w:r>
+              <w:t>2026-07-17T07:44:45.369+05:</w:t>
+            </w:r>
+            <w:proofErr w:type="gramStart"/>
+            <w:r>
+              <w:t>30  INFO</w:t>
+            </w:r>
+            <w:proofErr w:type="gramEnd"/>
+            <w:r>
+              <w:t xml:space="preserve"> 24296 --- [auth-service] </w:t>
+            </w:r>
+            <w:proofErr w:type="gramStart"/>
+            <w:r>
+              <w:t xml:space="preserve">[  </w:t>
+            </w:r>
+            <w:proofErr w:type="spellStart"/>
+            <w:r>
+              <w:t>restartedMain</w:t>
+            </w:r>
+            <w:proofErr w:type="spellEnd"/>
+            <w:proofErr w:type="gramEnd"/>
+            <w:r>
+              <w:t xml:space="preserve">] </w:t>
+            </w:r>
+            <w:proofErr w:type="spellStart"/>
+            <w:proofErr w:type="gramStart"/>
+            <w:r>
+              <w:t>o.a.c.c.C</w:t>
+            </w:r>
+            <w:proofErr w:type="spellEnd"/>
+            <w:r>
+              <w:t>.[</w:t>
+            </w:r>
+            <w:proofErr w:type="gramEnd"/>
+            <w:r>
+              <w:t>Tomcat</w:t>
+            </w:r>
+            <w:proofErr w:type="gramStart"/>
+            <w:r>
+              <w:t>].[</w:t>
+            </w:r>
+            <w:proofErr w:type="gramEnd"/>
+            <w:r>
+              <w:t>localhost</w:t>
+            </w:r>
+            <w:proofErr w:type="gramStart"/>
+            <w:r>
+              <w:t xml:space="preserve">].[/]   </w:t>
+            </w:r>
+            <w:proofErr w:type="gramEnd"/>
+            <w:r>
+              <w:t xml:space="preserve">  </w:t>
+            </w:r>
+            <w:proofErr w:type="gramStart"/>
+            <w:r>
+              <w:t xml:space="preserve">  :</w:t>
+            </w:r>
+            <w:proofErr w:type="gramEnd"/>
+            <w:r>
+              <w:t xml:space="preserve"> Initializing Spring embedded </w:t>
+            </w:r>
+            <w:proofErr w:type="spellStart"/>
+            <w:r>
+              <w:t>WebApplicationContext</w:t>
+            </w:r>
+            <w:proofErr w:type="spellEnd"/>
+          </w:p>
+          <w:p>
+            <w:r>
+              <w:t>2026-07-17T07:44:45.369+05:</w:t>
+            </w:r>
+            <w:proofErr w:type="gramStart"/>
+            <w:r>
+              <w:t>30  INFO</w:t>
+            </w:r>
+            <w:proofErr w:type="gramEnd"/>
+            <w:r>
+              <w:t xml:space="preserve"> 24296 --- [auth-service] </w:t>
+            </w:r>
+            <w:proofErr w:type="gramStart"/>
+            <w:r>
+              <w:t xml:space="preserve">[  </w:t>
+            </w:r>
+            <w:proofErr w:type="spellStart"/>
+            <w:r>
+              <w:t>restartedMain</w:t>
+            </w:r>
+            <w:proofErr w:type="spellEnd"/>
+            <w:proofErr w:type="gramEnd"/>
+            <w:r>
+              <w:t xml:space="preserve">] </w:t>
+            </w:r>
+            <w:proofErr w:type="spellStart"/>
+            <w:r>
+              <w:t>w.s.</w:t>
+            </w:r>
+            <w:proofErr w:type="gramStart"/>
+            <w:r>
+              <w:t>c.ServletWebServerApplicationContext</w:t>
+            </w:r>
+            <w:proofErr w:type="spellEnd"/>
+            <w:proofErr w:type="gramEnd"/>
+            <w:r>
+              <w:t xml:space="preserve"> : Root </w:t>
+            </w:r>
+            <w:proofErr w:type="spellStart"/>
+            <w:r>
+              <w:t>WebApplicationContext</w:t>
+            </w:r>
+            <w:proofErr w:type="spellEnd"/>
+            <w:r>
+              <w:t xml:space="preserve">: initialization completed in 1210 </w:t>
+            </w:r>
+            <w:proofErr w:type="spellStart"/>
+            <w:r>
+              <w:t>ms</w:t>
+            </w:r>
+            <w:proofErr w:type="spellEnd"/>
+          </w:p>
+          <w:p>
+            <w:r>
+              <w:t>2026-07-17T07:44:46.397+05:</w:t>
+            </w:r>
+            <w:proofErr w:type="gramStart"/>
+            <w:r>
+              <w:t>30  INFO</w:t>
+            </w:r>
+            <w:proofErr w:type="gramEnd"/>
+            <w:r>
+              <w:t xml:space="preserve"> 24296 --- [auth-service] </w:t>
+            </w:r>
+            <w:proofErr w:type="gramStart"/>
+            <w:r>
+              <w:t xml:space="preserve">[  </w:t>
+            </w:r>
+            <w:proofErr w:type="spellStart"/>
+            <w:r>
+              <w:t>restartedMain</w:t>
+            </w:r>
+            <w:proofErr w:type="spellEnd"/>
+            <w:proofErr w:type="gramEnd"/>
+            <w:r>
+              <w:t xml:space="preserve">] </w:t>
+            </w:r>
+            <w:proofErr w:type="spellStart"/>
+            <w:r>
+              <w:t>o.s.b.d.</w:t>
+            </w:r>
+            <w:proofErr w:type="gramStart"/>
+            <w:r>
+              <w:t>a.OptionalLiveReloadServer</w:t>
+            </w:r>
+            <w:proofErr w:type="spellEnd"/>
+            <w:proofErr w:type="gramEnd"/>
+            <w:r>
+              <w:t xml:space="preserve">     </w:t>
+            </w:r>
+            <w:proofErr w:type="gramStart"/>
+            <w:r>
+              <w:t xml:space="preserve">  :</w:t>
+            </w:r>
+            <w:proofErr w:type="gramEnd"/>
+            <w:r>
+              <w:t xml:space="preserve"> </w:t>
+            </w:r>
+            <w:proofErr w:type="spellStart"/>
+            <w:r>
+              <w:t>LiveReload</w:t>
+            </w:r>
+            <w:proofErr w:type="spellEnd"/>
+            <w:r>
+              <w:t xml:space="preserve"> server is running on port 35729</w:t>
+            </w:r>
+          </w:p>
+          <w:p>
+            <w:r>
+              <w:t>2026-07-17T07:44:46.407+05:</w:t>
+            </w:r>
+            <w:proofErr w:type="gramStart"/>
+            <w:r>
+              <w:t>30  INFO</w:t>
+            </w:r>
+            <w:proofErr w:type="gramEnd"/>
+            <w:r>
+              <w:t xml:space="preserve"> 24296 --- [auth-service] </w:t>
+            </w:r>
+            <w:proofErr w:type="gramStart"/>
+            <w:r>
+              <w:t xml:space="preserve">[  </w:t>
+            </w:r>
+            <w:proofErr w:type="spellStart"/>
+            <w:r>
+              <w:t>restartedMain</w:t>
+            </w:r>
+            <w:proofErr w:type="spellEnd"/>
+            <w:proofErr w:type="gramEnd"/>
+            <w:r>
+              <w:t xml:space="preserve">] </w:t>
+            </w:r>
+            <w:proofErr w:type="spellStart"/>
+            <w:proofErr w:type="gramStart"/>
+            <w:r>
+              <w:t>o.s.b.a.e.web.EndpointLinksResolver</w:t>
+            </w:r>
+            <w:proofErr w:type="spellEnd"/>
+            <w:proofErr w:type="gramEnd"/>
+            <w:r>
+              <w:t xml:space="preserve">    </w:t>
+            </w:r>
+            <w:proofErr w:type="gramStart"/>
+            <w:r>
+              <w:t xml:space="preserve">  :</w:t>
+            </w:r>
+            <w:proofErr w:type="gramEnd"/>
+            <w:r>
+              <w:t xml:space="preserve"> Exposing 2 endpoints beneath base path '/actuator'</w:t>
+            </w:r>
+          </w:p>
+          <w:p>
+            <w:pPr>
+              <w:rPr>
+                <w:b/>
+                <w:bCs/>
+              </w:rPr>
+            </w:pPr>
+            <w:r>
+              <w:t>2026-07-17T07:44:46.482+05:</w:t>
+            </w:r>
+            <w:proofErr w:type="gramStart"/>
+            <w:r>
+              <w:t>30  INFO</w:t>
+            </w:r>
+            <w:proofErr w:type="gramEnd"/>
+            <w:r>
+              <w:t xml:space="preserve"> 24296 --- [auth-service] </w:t>
+            </w:r>
+            <w:proofErr w:type="gramStart"/>
+            <w:r>
+              <w:t xml:space="preserve">[  </w:t>
+            </w:r>
+            <w:proofErr w:type="spellStart"/>
+            <w:r>
+              <w:t>restartedMain</w:t>
+            </w:r>
+            <w:proofErr w:type="spellEnd"/>
+            <w:proofErr w:type="gramEnd"/>
+            <w:r>
+              <w:t xml:space="preserve">] </w:t>
+            </w:r>
+            <w:proofErr w:type="spellStart"/>
+            <w:r>
+              <w:t>o.s.b.</w:t>
+            </w:r>
+            <w:proofErr w:type="gramStart"/>
+            <w:r>
+              <w:t>w.embedded</w:t>
+            </w:r>
+            <w:proofErr w:type="gramEnd"/>
+            <w:r>
+              <w:t>.</w:t>
+            </w:r>
+            <w:proofErr w:type="gramStart"/>
+            <w:r>
+              <w:t>tomcat.TomcatWebServer</w:t>
+            </w:r>
+            <w:proofErr w:type="spellEnd"/>
+            <w:r>
+              <w:t xml:space="preserve">  :</w:t>
+            </w:r>
+            <w:proofErr w:type="gramEnd"/>
+            <w:r>
+              <w:t xml:space="preserve"> </w:t>
+            </w:r>
+            <w:r>
+              <w:rPr>
+                <w:b/>
+                <w:bCs/>
+              </w:rPr>
+              <w:t>Tomcat started on port 8081 (http) with context path '/'</w:t>
+            </w:r>
+          </w:p>
+          <w:p>
+            <w:r>
+              <w:t>2026-07-17T07:44:46.497+05:</w:t>
+            </w:r>
+            <w:proofErr w:type="gramStart"/>
+            <w:r>
+              <w:t>30  INFO</w:t>
+            </w:r>
+            <w:proofErr w:type="gramEnd"/>
+            <w:r>
+              <w:t xml:space="preserve"> 24296 --- [auth-service] </w:t>
+            </w:r>
+            <w:proofErr w:type="gramStart"/>
+            <w:r>
+              <w:t xml:space="preserve">[  </w:t>
+            </w:r>
+            <w:proofErr w:type="spellStart"/>
+            <w:r>
+              <w:t>restartedMain</w:t>
+            </w:r>
+            <w:proofErr w:type="spellEnd"/>
+            <w:proofErr w:type="gramEnd"/>
+            <w:r>
+              <w:t xml:space="preserve">] </w:t>
+            </w:r>
+            <w:proofErr w:type="spellStart"/>
+            <w:r>
+              <w:t>c.</w:t>
+            </w:r>
+            <w:proofErr w:type="gramStart"/>
+            <w:r>
+              <w:t>r.auth</w:t>
+            </w:r>
+            <w:proofErr w:type="gramEnd"/>
+            <w:r>
+              <w:t>.AuthServiceApplication</w:t>
+            </w:r>
+            <w:proofErr w:type="spellEnd"/>
+            <w:r>
+              <w:t xml:space="preserve">        </w:t>
+            </w:r>
+            <w:proofErr w:type="gramStart"/>
+            <w:r>
+              <w:t xml:space="preserve">  :</w:t>
+            </w:r>
+            <w:proofErr w:type="gramEnd"/>
+            <w:r>
+              <w:t xml:space="preserve"> Started </w:t>
+            </w:r>
+            <w:proofErr w:type="spellStart"/>
+            <w:r>
+              <w:t>AuthServiceApplication</w:t>
+            </w:r>
+            <w:proofErr w:type="spellEnd"/>
+            <w:r>
+              <w:t xml:space="preserve"> in 3.073 seconds (process running for 4.236)</w:t>
+            </w:r>
+          </w:p>
+          <w:p>
+            <w:r>
+              <w:t>2026-07-17T07:44:47.006+05:</w:t>
+            </w:r>
+            <w:proofErr w:type="gramStart"/>
+            <w:r>
+              <w:t>30  INFO</w:t>
+            </w:r>
+            <w:proofErr w:type="gramEnd"/>
+            <w:r>
+              <w:t xml:space="preserve"> 24296 --- [auth-service] [4)-192.168.1.12] </w:t>
+            </w:r>
+            <w:proofErr w:type="spellStart"/>
+            <w:proofErr w:type="gramStart"/>
+            <w:r>
+              <w:t>o.a.c.c.C</w:t>
+            </w:r>
+            <w:proofErr w:type="spellEnd"/>
+            <w:r>
+              <w:t>.[</w:t>
+            </w:r>
+            <w:proofErr w:type="gramEnd"/>
+            <w:r>
+              <w:t>Tomcat</w:t>
+            </w:r>
+            <w:proofErr w:type="gramStart"/>
+            <w:r>
+              <w:t>].[</w:t>
+            </w:r>
+            <w:proofErr w:type="gramEnd"/>
+            <w:r>
+              <w:t>localhost</w:t>
+            </w:r>
+            <w:proofErr w:type="gramStart"/>
+            <w:r>
+              <w:t xml:space="preserve">].[/]   </w:t>
+            </w:r>
+            <w:proofErr w:type="gramEnd"/>
+            <w:r>
+              <w:t xml:space="preserve">  </w:t>
+            </w:r>
+            <w:proofErr w:type="gramStart"/>
+            <w:r>
+              <w:t xml:space="preserve">  :</w:t>
+            </w:r>
+            <w:proofErr w:type="gramEnd"/>
+            <w:r>
+              <w:t xml:space="preserve"> Initializing Spring </w:t>
+            </w:r>
+            <w:proofErr w:type="spellStart"/>
+            <w:r>
+              <w:t>DispatcherServlet</w:t>
+            </w:r>
+            <w:proofErr w:type="spellEnd"/>
+            <w:r>
+              <w:t xml:space="preserve"> '</w:t>
+            </w:r>
+            <w:proofErr w:type="spellStart"/>
+            <w:r>
+              <w:t>dispatcherServlet</w:t>
+            </w:r>
+            <w:proofErr w:type="spellEnd"/>
+            <w:r>
+              <w:t>'</w:t>
+            </w:r>
+          </w:p>
+          <w:p>
+            <w:r>
+              <w:t>2026-07-17T07:44:47.008+05:</w:t>
+            </w:r>
+            <w:proofErr w:type="gramStart"/>
+            <w:r>
+              <w:t>30  INFO</w:t>
+            </w:r>
+            <w:proofErr w:type="gramEnd"/>
+            <w:r>
+              <w:t xml:space="preserve"> 24296 --- [auth-service] [4)-192.168.1.12] </w:t>
+            </w:r>
+            <w:proofErr w:type="spellStart"/>
+            <w:proofErr w:type="gramStart"/>
+            <w:r>
+              <w:t>o.s.web.servlet</w:t>
+            </w:r>
+            <w:proofErr w:type="gramEnd"/>
+            <w:r>
+              <w:t>.DispatcherServlet</w:t>
+            </w:r>
+            <w:proofErr w:type="spellEnd"/>
+            <w:r>
+              <w:t xml:space="preserve">      </w:t>
+            </w:r>
+            <w:proofErr w:type="gramStart"/>
+            <w:r>
+              <w:t xml:space="preserve">  :</w:t>
+            </w:r>
+            <w:proofErr w:type="gramEnd"/>
+            <w:r>
+              <w:t xml:space="preserve"> Initializing Servlet '</w:t>
+            </w:r>
+            <w:proofErr w:type="spellStart"/>
+            <w:r>
+              <w:t>dispatcherServlet</w:t>
+            </w:r>
+            <w:proofErr w:type="spellEnd"/>
+            <w:r>
+              <w:t>'</w:t>
+            </w:r>
+          </w:p>
+          <w:p>
+            <w:r>
+              <w:t>2026-07-17T07:44:47.010+05:</w:t>
+            </w:r>
+            <w:proofErr w:type="gramStart"/>
+            <w:r>
+              <w:t>30  INFO</w:t>
+            </w:r>
+            <w:proofErr w:type="gramEnd"/>
+            <w:r>
+              <w:t xml:space="preserve"> 24296 --- [auth-service] [4)-192.168.1.12] </w:t>
+            </w:r>
+            <w:proofErr w:type="spellStart"/>
+            <w:proofErr w:type="gramStart"/>
+            <w:r>
+              <w:t>o.s.web.servlet</w:t>
+            </w:r>
+            <w:proofErr w:type="gramEnd"/>
+            <w:r>
+              <w:t>.DispatcherServlet</w:t>
+            </w:r>
+            <w:proofErr w:type="spellEnd"/>
+            <w:r>
+              <w:t xml:space="preserve">      </w:t>
+            </w:r>
+            <w:proofErr w:type="gramStart"/>
+            <w:r>
+              <w:t xml:space="preserve">  :</w:t>
+            </w:r>
+            <w:proofErr w:type="gramEnd"/>
+            <w:r>
+              <w:t xml:space="preserve"> Completed initialization in 2 </w:t>
+            </w:r>
+            <w:proofErr w:type="spellStart"/>
+            <w:r>
+              <w:t>ms</w:t>
+            </w:r>
+            <w:proofErr w:type="spellEnd"/>
+          </w:p>
+        </w:tc>
+      </w:tr>
+    </w:tbl>
+    <w:p/>
+    <w:p>
+      <w:r>
+        <w:br w:type="page"/>
+      </w:r>
+    </w:p>
+    <w:p>
+      <w:proofErr w:type="spellStart"/>
+      <w:r>
+        <w:lastRenderedPageBreak/>
+        <w:t>Url</w:t>
+      </w:r>
+      <w:proofErr w:type="spellEnd"/>
+      <w:r>
+        <w:t xml:space="preserve"> to </w:t>
+      </w:r>
+      <w:proofErr w:type="gramStart"/>
+      <w:r>
+        <w:t>test :</w:t>
+      </w:r>
+      <w:proofErr w:type="gramEnd"/>
+      <w:r>
+        <w:t xml:space="preserve"> We should status=UP</w:t>
+      </w:r>
+    </w:p>
+    <w:p>
+      <w:hyperlink r:id="rId5" w:history="1">
+        <w:r>
+          <w:rPr>
+            <w:rStyle w:val="Hyperlink"/>
+          </w:rPr>
+          <w:t>http://localhost:8081/actuator/health</w:t>
+        </w:r>
+      </w:hyperlink>
+    </w:p>
+    <w:p>
+      <w:r>
+        <w:drawing>
+          <wp:inline distT="0" distB="0" distL="0" distR="0" wp14:anchorId="17CF393D" wp14:editId="684B7BF0">
+            <wp:extent cx="5943600" cy="5245735"/>
+            <wp:effectExtent l="0" t="0" r="0" b="0"/>
+            <wp:docPr id="1217756029" name="Picture 1"/>
+            <wp:cNvGraphicFramePr>
+              <a:graphicFrameLocks xmlns:a="http://schemas.openxmlformats.org/drawingml/2006/main" noChangeAspect="1"/>
+            </wp:cNvGraphicFramePr>
+            <a:graphic xmlns:a="http://schemas.openxmlformats.org/drawingml/2006/main">
+              <a:graphicData uri="http://schemas.openxmlformats.org/drawingml/2006/picture">
+                <pic:pic xmlns:pic="http://schemas.openxmlformats.org/drawingml/2006/picture">
+                  <pic:nvPicPr>
+                    <pic:cNvPr id="1217756029" name=""/>
+                    <pic:cNvPicPr/>
+                  </pic:nvPicPr>
+                  <pic:blipFill>
+                    <a:blip r:embed="rId6"/>
+                    <a:stretch>
+                      <a:fillRect/>
+                    </a:stretch>
+                  </pic:blipFill>
+                  <pic:spPr>
+                    <a:xfrm>
+                      <a:off x="0" y="0"/>
+                      <a:ext cx="5943600" cy="5245735"/>
+                    </a:xfrm>
+                    <a:prstGeom prst="rect">
+                      <a:avLst/>
+                    </a:prstGeom>
+                  </pic:spPr>
+                </pic:pic>
+              </a:graphicData>
+            </a:graphic>
+          </wp:inline>
+        </w:drawing>
+      </w:r>
+    </w:p>
+    <w:p/>
+    <w:p>
+      <w:r>
+        <w:t xml:space="preserve">First </w:t>
+      </w:r>
+      <w:proofErr w:type="spellStart"/>
+      <w:r>
+        <w:t>MicroService</w:t>
+      </w:r>
+      <w:proofErr w:type="spellEnd"/>
+      <w:r>
+        <w:t xml:space="preserve"> run successfully.</w:t>
+      </w:r>
+    </w:p>
+    <w:p>
+      <w:r>
+        <w:t>It means auth Service is alive.</w:t>
+      </w:r>
+    </w:p>
+    <w:p/>
+    <w:p>
+      <w:r>
+        <w:br w:type="page"/>
+      </w:r>
+    </w:p>
+    <w:p>
+      <w:r>
+        <w:lastRenderedPageBreak/>
+        <w:t xml:space="preserve">Qn. What is Tomcat Server and why </w:t>
+      </w:r>
+      <w:proofErr w:type="gramStart"/>
+      <w:r>
+        <w:t>we</w:t>
+      </w:r>
+      <w:proofErr w:type="gramEnd"/>
+      <w:r>
+        <w:t xml:space="preserve"> need it?</w:t>
+      </w:r>
+    </w:p>
+    <w:p>
+      <w:proofErr w:type="gramStart"/>
+      <w:r>
+        <w:t>Ans :</w:t>
+      </w:r>
+      <w:proofErr w:type="gramEnd"/>
+    </w:p>
+    <w:p>
+      <w:r>
+        <w:t xml:space="preserve">Tomcat is an embedded servlet container that listens </w:t>
+      </w:r>
+      <w:proofErr w:type="gramStart"/>
+      <w:r>
+        <w:t>for</w:t>
+      </w:r>
+      <w:proofErr w:type="gramEnd"/>
+      <w:r>
+        <w:t xml:space="preserve"> HTTP requests, forwards them to Spring Boot controllers, and sends the generated responses back to the client. Because Spring Boot embeds Tomcat by default through spring-boot-starter-web, we don't need to install or configure a separate application server.</w:t>
+      </w:r>
+    </w:p>
+    <w:p>
+      <w:proofErr w:type="gramStart"/>
+      <w:r>
+        <w:t>Example :</w:t>
+      </w:r>
+      <w:proofErr w:type="gramEnd"/>
+    </w:p>
+    <w:p>
+      <w:r>
+        <w:t>Suppose we have this program.</w:t>
+      </w:r>
+    </w:p>
+    <w:p>
+      <w:r>
+        <w:t>Public class Rahul</w:t>
+      </w:r>
+    </w:p>
+    <w:p>
+      <w:r>
+        <w:t>{</w:t>
+      </w:r>
+    </w:p>
+    <w:p>
+      <w:r>
+        <w:t xml:space="preserve">Public static void </w:t>
+      </w:r>
+      <w:proofErr w:type="gramStart"/>
+      <w:r>
+        <w:t>main(String[</w:t>
+      </w:r>
+      <w:proofErr w:type="gramEnd"/>
+      <w:r>
+        <w:t xml:space="preserve">] </w:t>
+      </w:r>
+      <w:proofErr w:type="spellStart"/>
+      <w:r>
+        <w:t>args</w:t>
+      </w:r>
+      <w:proofErr w:type="spellEnd"/>
+      <w:r>
+        <w:t>)</w:t>
+      </w:r>
+    </w:p>
+    <w:p>
+      <w:r>
+        <w:t>{</w:t>
+      </w:r>
+    </w:p>
+    <w:p>
+      <w:r>
+        <w:tab/>
+      </w:r>
+      <w:proofErr w:type="spellStart"/>
+      <w:r>
+        <w:t>System.out.println</w:t>
+      </w:r>
+      <w:proofErr w:type="spellEnd"/>
+      <w:r>
+        <w:t xml:space="preserve">(“Hi </w:t>
+      </w:r>
+      <w:proofErr w:type="spellStart"/>
+      <w:r>
+        <w:t>Im</w:t>
+      </w:r>
+      <w:proofErr w:type="spellEnd"/>
+      <w:r>
+        <w:t xml:space="preserve"> application health and </w:t>
+      </w:r>
+      <w:proofErr w:type="spellStart"/>
+      <w:r>
+        <w:t>Im</w:t>
+      </w:r>
+      <w:proofErr w:type="spellEnd"/>
+      <w:r>
+        <w:t xml:space="preserve"> OK”);</w:t>
+      </w:r>
+    </w:p>
+    <w:p>
+      <w:r>
+        <w:t>}</w:t>
+      </w:r>
+    </w:p>
+    <w:p>
+      <w:r>
+        <w:t>}</w:t>
+      </w:r>
+    </w:p>
+    <w:p/>
+    <w:p>
+      <w:r>
+        <w:t xml:space="preserve">Now, if we run this program we will see the output in only terminal. Now suppose if someone also wants to see the output in browser at this </w:t>
+      </w:r>
+      <w:r>
+        <w:t>location:</w:t>
+      </w:r>
+      <w:r>
+        <w:t xml:space="preserve"> ‘https://localhost:8081/health’. Then JAVA can’t do that. To do this work we </w:t>
+      </w:r>
+      <w:r>
+        <w:t>need</w:t>
+      </w:r>
+      <w:r>
+        <w:t xml:space="preserve"> a server. Which </w:t>
+      </w:r>
+      <w:proofErr w:type="spellStart"/>
+      <w:r>
+        <w:t>SpringBoot</w:t>
+      </w:r>
+      <w:proofErr w:type="spellEnd"/>
+      <w:r>
+        <w:t xml:space="preserve"> provided us </w:t>
+      </w:r>
+      <w:proofErr w:type="gramStart"/>
+      <w:r>
+        <w:t xml:space="preserve">as </w:t>
+      </w:r>
+      <w:r>
+        <w:t>embedded</w:t>
+      </w:r>
+      <w:proofErr w:type="gramEnd"/>
+      <w:r>
+        <w:t xml:space="preserve"> version of tomcat server coming from SPRING-BOOT-STARTER-WEB.</w:t>
+      </w:r>
+    </w:p>
+    <w:p/>
     <w:p/>
     <w:sectPr>
       <w:pgSz w:w="12240" w:h="15840"/>
@@ -1641,6 +3141,60 @@
       <w:spacing w:val="5"/>
     </w:rPr>
   </w:style>
+  <w:style w:type="table" w:styleId="TableGrid">
+    <w:name w:val="Table Grid"/>
+    <w:basedOn w:val="TableNormal"/>
+    <w:uiPriority w:val="39"/>
+    <w:rsid w:val="000F418A"/>
+    <w:pPr>
+      <w:spacing w:after="0" w:line="240" w:lineRule="auto"/>
+    </w:pPr>
+    <w:tblPr>
+      <w:tblBorders>
+        <w:top w:val="single" w:sz="4" w:space="0" w:color="auto"/>
+        <w:left w:val="single" w:sz="4" w:space="0" w:color="auto"/>
+        <w:bottom w:val="single" w:sz="4" w:space="0" w:color="auto"/>
+        <w:right w:val="single" w:sz="4" w:space="0" w:color="auto"/>
+        <w:insideH w:val="single" w:sz="4" w:space="0" w:color="auto"/>
+        <w:insideV w:val="single" w:sz="4" w:space="0" w:color="auto"/>
+      </w:tblBorders>
+    </w:tblPr>
+  </w:style>
+  <w:style w:type="character" w:styleId="Hyperlink">
+    <w:name w:val="Hyperlink"/>
+    <w:basedOn w:val="DefaultParagraphFont"/>
+    <w:uiPriority w:val="99"/>
+    <w:unhideWhenUsed/>
+    <w:rsid w:val="000F418A"/>
+    <w:rPr>
+      <w:color w:val="467886" w:themeColor="hyperlink"/>
+      <w:u w:val="single"/>
+    </w:rPr>
+  </w:style>
+  <w:style w:type="character" w:styleId="UnresolvedMention">
+    <w:name w:val="Unresolved Mention"/>
+    <w:basedOn w:val="DefaultParagraphFont"/>
+    <w:uiPriority w:val="99"/>
+    <w:semiHidden/>
+    <w:unhideWhenUsed/>
+    <w:rsid w:val="000F418A"/>
+    <w:rPr>
+      <w:color w:val="605E5C"/>
+      <w:shd w:val="clear" w:color="auto" w:fill="E1DFDD"/>
+    </w:rPr>
+  </w:style>
+  <w:style w:type="character" w:styleId="FollowedHyperlink">
+    <w:name w:val="FollowedHyperlink"/>
+    <w:basedOn w:val="DefaultParagraphFont"/>
+    <w:uiPriority w:val="99"/>
+    <w:semiHidden/>
+    <w:unhideWhenUsed/>
+    <w:rsid w:val="00C80061"/>
+    <w:rPr>
+      <w:color w:val="96607D" w:themeColor="followedHyperlink"/>
+      <w:u w:val="single"/>
+    </w:rPr>
+  </w:style>
 </w:styles>
 </file>
 

</xml_diff>